<commit_message>
Add Magi Vision as current role and flagship project
- Experience, Resume Mode, and DOCX: Founder & Engineer, Magi Vision (Apr 2026 - Present)
- Flagship project card with magivision.io demo video and Watch demo link
- Hero label, footer "Currently" line, project copy refresh
- DOCX synced with Resume Mode; DARPA bullet reworded to match magivision.io

Co-Authored-By: Claude Opus 5.5 <noreply@anthropic.com>
</commit_message>
<xml_diff>
--- a/Shaker_Zaman_Resume.docx
+++ b/Shaker_Zaman_Resume.docx
@@ -291,7 +291,7 @@
           <w:sz w:val="19"/>
           <w:shd w:fill="auto" w:val="clear"/>
         </w:rPr>
-        <w:t xml:space="preserve">Head of Operations</w:t>
+        <w:t xml:space="preserve">Founder &amp; Engineer</w:t>
       </w:r>
       <w:r>
         <w:rPr>
@@ -302,7 +302,7 @@
           <w:sz w:val="19"/>
           <w:shd w:fill="auto" w:val="clear"/>
         </w:rPr>
-        <w:t xml:space="preserve">  |  Morph Labs</w:t>
+        <w:t xml:space="preserve">  |  Magi Vision</w:t>
       </w:r>
       <w:r>
         <w:rPr>
@@ -325,7 +325,7 @@
           <w:sz w:val="18"/>
           <w:shd w:fill="auto" w:val="clear"/>
         </w:rPr>
-        <w:t xml:space="preserve">Mar 2025 - Mar 2026</w:t>
+        <w:t xml:space="preserve">Apr 2026 - Present</w:t>
       </w:r>
     </w:p>
     <w:p>
@@ -352,7 +352,7 @@
           <w:sz w:val="17"/>
           <w:shd w:fill="auto" w:val="clear"/>
         </w:rPr>
-        <w:t xml:space="preserve">Core operator at a fast-moving AI infrastructure startup (Khosla-backed, $5.75M seed). Owned 10+ functional areas in a high-tempo environment with tight deadlines and constant priority shifts, using AI-agent-augmented workflows to pivot on the spot and operate at the speed of a cross-functional team.</w:t>
+        <w:t xml:space="preserve">Computer vision for combat sports, currently focused on grappling  |  magivision.io</w:t>
       </w:r>
     </w:p>
     <w:p>
@@ -382,7 +382,7 @@
           <w:sz w:val="18"/>
           <w:shd w:fill="auto" w:val="clear"/>
         </w:rPr>
-        <w:t xml:space="preserve">Core operator at a fast-moving AI infrastructure startup (Khosla-backed, $5.75M seed). Owned 10+ functional areas in a high-tempo environment with tight deadlines and constant priority shifts, using AI-agent-augmented workflows to pivot on the spot and operate at the speed of a cross-functional team.</w:t>
+        <w:t xml:space="preserve">Building a video analysis platform for grappling, connecting mat-side capture, pose estimation, and coach-facing review.</w:t>
       </w:r>
     </w:p>
     <w:p>
@@ -412,7 +412,7 @@
           <w:sz w:val="18"/>
           <w:shd w:fill="auto" w:val="clear"/>
         </w:rPr>
-        <w:t xml:space="preserve">Drove SOC 2 Type I completion end-to-end via Vanta, including policy authoring, MDM configuration (NanoMDM), device offboarding checklists, and evidence collection using AI-assisted compliance drafting.</w:t>
+        <w:t xml:space="preserve">Built the recording and analysis pipeline, operator tools, and annotation workflows that turn training footage into traceable evaluation data.</w:t>
       </w:r>
     </w:p>
     <w:p>
@@ -442,7 +442,7 @@
           <w:sz w:val="18"/>
           <w:shd w:fill="auto" w:val="clear"/>
         </w:rPr>
-        <w:t xml:space="preserve">Contributed copy for all product marketing across Infinibranch platform launches (Liquid Metal, Browsers) spanning Twitter, LinkedIn, email, and Slack.</w:t>
+        <w:t xml:space="preserve">Separated recording from inference to protect footage under load, and built versioned annotation packs and evaluation workflows to test model changes against reviewed evidence.</w:t>
       </w:r>
     </w:p>
     <w:p>
@@ -472,149 +472,7 @@
           <w:sz w:val="18"/>
           <w:shd w:fill="auto" w:val="clear"/>
         </w:rPr>
-        <w:t xml:space="preserve">Built and executed influencer pricing playbook with CPM-based framework, CAC ceiling modeling ($50/signup), and brand-safety criteria for CLI coding-agent creator partnerships.</w:t>
-      </w:r>
-    </w:p>
-    <w:p>
-      <w:pPr>
-        <w:numPr>
-          <w:ilvl w:val="0"/>
-          <w:numId w:val="10"/>
-        </w:numPr>
-        <w:spacing w:before="15" w:after="15" w:line="240"/>
-        <w:ind w:right="0" w:left="450" w:hanging="220"/>
-        <w:jc w:val="left"/>
-        <w:rPr>
-          <w:rFonts w:ascii="Arial" w:hAnsi="Arial" w:cs="Arial" w:eastAsia="Arial"/>
-          <w:color w:val="333333"/>
-          <w:spacing w:val="0"/>
-          <w:position w:val="0"/>
-          <w:sz w:val="18"/>
-          <w:shd w:fill="auto" w:val="clear"/>
-        </w:rPr>
-      </w:pPr>
-      <w:r>
-        <w:rPr>
-          <w:rFonts w:ascii="Arial" w:hAnsi="Arial" w:cs="Arial" w:eastAsia="Arial"/>
-          <w:color w:val="333333"/>
-          <w:spacing w:val="0"/>
-          <w:position w:val="0"/>
-          <w:sz w:val="18"/>
-          <w:shd w:fill="auto" w:val="clear"/>
-        </w:rPr>
-        <w:t xml:space="preserve">Designed a customizable recruiting pipeline with configurable targeting parameters (degree type, GitHub activity heuristics, commit frequency, OSS contribution depth) and AI-driven candidate discovery and outreach personalization.</w:t>
-      </w:r>
-    </w:p>
-    <w:p>
-      <w:pPr>
-        <w:numPr>
-          <w:ilvl w:val="0"/>
-          <w:numId w:val="10"/>
-        </w:numPr>
-        <w:spacing w:before="15" w:after="15" w:line="240"/>
-        <w:ind w:right="0" w:left="450" w:hanging="220"/>
-        <w:jc w:val="left"/>
-        <w:rPr>
-          <w:rFonts w:ascii="Arial" w:hAnsi="Arial" w:cs="Arial" w:eastAsia="Arial"/>
-          <w:color w:val="333333"/>
-          <w:spacing w:val="0"/>
-          <w:position w:val="0"/>
-          <w:sz w:val="18"/>
-          <w:shd w:fill="auto" w:val="clear"/>
-        </w:rPr>
-      </w:pPr>
-      <w:r>
-        <w:rPr>
-          <w:rFonts w:ascii="Arial" w:hAnsi="Arial" w:cs="Arial" w:eastAsia="Arial"/>
-          <w:color w:val="333333"/>
-          <w:spacing w:val="0"/>
-          <w:position w:val="0"/>
-          <w:sz w:val="18"/>
-          <w:shd w:fill="auto" w:val="clear"/>
-        </w:rPr>
-        <w:t xml:space="preserve">Managed Stripe billing infrastructure, SendGrid email campaigns, and built fraud detection systems for the platform's internal credit system.</w:t>
-      </w:r>
-    </w:p>
-    <w:p>
-      <w:pPr>
-        <w:numPr>
-          <w:ilvl w:val="0"/>
-          <w:numId w:val="10"/>
-        </w:numPr>
-        <w:spacing w:before="15" w:after="15" w:line="240"/>
-        <w:ind w:right="0" w:left="450" w:hanging="220"/>
-        <w:jc w:val="left"/>
-        <w:rPr>
-          <w:rFonts w:ascii="Arial" w:hAnsi="Arial" w:cs="Arial" w:eastAsia="Arial"/>
-          <w:color w:val="333333"/>
-          <w:spacing w:val="0"/>
-          <w:position w:val="0"/>
-          <w:sz w:val="18"/>
-          <w:shd w:fill="auto" w:val="clear"/>
-        </w:rPr>
-      </w:pPr>
-      <w:r>
-        <w:rPr>
-          <w:rFonts w:ascii="Arial" w:hAnsi="Arial" w:cs="Arial" w:eastAsia="Arial"/>
-          <w:color w:val="333333"/>
-          <w:spacing w:val="0"/>
-          <w:position w:val="0"/>
-          <w:sz w:val="18"/>
-          <w:shd w:fill="auto" w:val="clear"/>
-        </w:rPr>
-        <w:t xml:space="preserve">Conducted YC company research and built targeted outbound email campaigns for enterprise GTM motion.</w:t>
-      </w:r>
-    </w:p>
-    <w:p>
-      <w:pPr>
-        <w:numPr>
-          <w:ilvl w:val="0"/>
-          <w:numId w:val="10"/>
-        </w:numPr>
-        <w:spacing w:before="15" w:after="15" w:line="240"/>
-        <w:ind w:right="0" w:left="450" w:hanging="220"/>
-        <w:jc w:val="left"/>
-        <w:rPr>
-          <w:rFonts w:ascii="Arial" w:hAnsi="Arial" w:cs="Arial" w:eastAsia="Arial"/>
-          <w:color w:val="333333"/>
-          <w:spacing w:val="0"/>
-          <w:position w:val="0"/>
-          <w:sz w:val="18"/>
-          <w:shd w:fill="auto" w:val="clear"/>
-        </w:rPr>
-      </w:pPr>
-      <w:r>
-        <w:rPr>
-          <w:rFonts w:ascii="Arial" w:hAnsi="Arial" w:cs="Arial" w:eastAsia="Arial"/>
-          <w:color w:val="333333"/>
-          <w:spacing w:val="0"/>
-          <w:position w:val="0"/>
-          <w:sz w:val="18"/>
-          <w:shd w:fill="auto" w:val="clear"/>
-        </w:rPr>
-        <w:t xml:space="preserve">Assisted in preparing a DARPA Seedling cost proposal (expMath program), contributing to budget modeling, narrative drafting, and compliance formatting</w:t>
-      </w:r>
-      <w:r>
-        <w:rPr>
-          <w:rFonts w:ascii="Arial" w:hAnsi="Arial" w:cs="Arial" w:eastAsia="Arial"/>
-          <w:color w:val="333333"/>
-          <w:spacing w:val="0"/>
-          <w:position w:val="0"/>
-          <w:sz w:val="18"/>
-          <w:shd w:fill="auto" w:val="clear"/>
-        </w:rPr>
-        <w:t xml:space="preserve">—</w:t>
-      </w:r>
-      <w:r>
-        <w:rPr>
-          <w:rFonts w:ascii="Arial" w:hAnsi="Arial" w:cs="Arial" w:eastAsia="Arial"/>
-          <w:color w:val="333333"/>
-          <w:spacing w:val="0"/>
-          <w:position w:val="0"/>
-          <w:sz w:val="18"/>
-          <w:shd w:fill="auto" w:val="clear"/>
-        </w:rPr>
-        <w:t xml:space="preserve">proposal was awarded.</w:t>
+        <w:t xml:space="preserve">Lead engineering and operations alongside a design and sports-domain team, using gym capture sessions to guide product development and test what the system can reliably explain.</w:t>
       </w:r>
     </w:p>
     <w:p>
@@ -644,6 +502,337 @@
           <w:sz w:val="19"/>
           <w:shd w:fill="auto" w:val="clear"/>
         </w:rPr>
+        <w:t xml:space="preserve">Head of Operations</w:t>
+      </w:r>
+      <w:r>
+        <w:rPr>
+          <w:rFonts w:ascii="Arial" w:hAnsi="Arial" w:cs="Arial" w:eastAsia="Arial"/>
+          <w:color w:val="555555"/>
+          <w:spacing w:val="0"/>
+          <w:position w:val="0"/>
+          <w:sz w:val="19"/>
+          <w:shd w:fill="auto" w:val="clear"/>
+        </w:rPr>
+        <w:t xml:space="preserve">  |  Morph Labs</w:t>
+      </w:r>
+      <w:r>
+        <w:rPr>
+          <w:rFonts w:ascii="Arial" w:hAnsi="Arial" w:cs="Arial" w:eastAsia="Arial"/>
+          <w:color w:val="333333"/>
+          <w:spacing w:val="0"/>
+          <w:position w:val="0"/>
+          <w:sz w:val="19"/>
+          <w:shd w:fill="auto" w:val="clear"/>
+        </w:rPr>
+        <w:tab/>
+      </w:r>
+      <w:r>
+        <w:rPr>
+          <w:rFonts w:ascii="Arial" w:hAnsi="Arial" w:cs="Arial" w:eastAsia="Arial"/>
+          <w:i/>
+          <w:color w:val="555555"/>
+          <w:spacing w:val="0"/>
+          <w:position w:val="0"/>
+          <w:sz w:val="18"/>
+          <w:shd w:fill="auto" w:val="clear"/>
+        </w:rPr>
+        <w:t xml:space="preserve">Mar 2025 - Mar 2026</w:t>
+      </w:r>
+    </w:p>
+    <w:p>
+      <w:pPr>
+        <w:spacing w:before="15" w:after="20" w:line="240"/>
+        <w:ind w:right="0" w:left="0" w:firstLine="0"/>
+        <w:jc w:val="left"/>
+        <w:rPr>
+          <w:rFonts w:ascii="Arial" w:hAnsi="Arial" w:cs="Arial" w:eastAsia="Arial"/>
+          <w:color w:val="333333"/>
+          <w:spacing w:val="0"/>
+          <w:position w:val="0"/>
+          <w:sz w:val="18"/>
+          <w:shd w:fill="auto" w:val="clear"/>
+        </w:rPr>
+      </w:pPr>
+      <w:r>
+        <w:rPr>
+          <w:rFonts w:ascii="Arial" w:hAnsi="Arial" w:cs="Arial" w:eastAsia="Arial"/>
+          <w:i/>
+          <w:color w:val="555555"/>
+          <w:spacing w:val="0"/>
+          <w:position w:val="0"/>
+          <w:sz w:val="17"/>
+          <w:shd w:fill="auto" w:val="clear"/>
+        </w:rPr>
+        <w:t xml:space="preserve">Core operator at a fast-moving AI infrastructure startup (Khosla-backed, $5.75M seed). Owned 10+ functional areas in a high-tempo environment with tight deadlines and constant priority shifts, using AI-agent-augmented workflows to pivot on the spot and operate at the speed of a cross-functional team.</w:t>
+      </w:r>
+    </w:p>
+    <w:p>
+      <w:pPr>
+        <w:numPr>
+          <w:ilvl w:val="0"/>
+          <w:numId w:val="10"/>
+        </w:numPr>
+        <w:spacing w:before="15" w:after="15" w:line="240"/>
+        <w:ind w:right="0" w:left="450" w:hanging="220"/>
+        <w:jc w:val="left"/>
+        <w:rPr>
+          <w:rFonts w:ascii="Arial" w:hAnsi="Arial" w:cs="Arial" w:eastAsia="Arial"/>
+          <w:color w:val="333333"/>
+          <w:spacing w:val="0"/>
+          <w:position w:val="0"/>
+          <w:sz w:val="18"/>
+          <w:shd w:fill="auto" w:val="clear"/>
+        </w:rPr>
+      </w:pPr>
+      <w:r>
+        <w:rPr>
+          <w:rFonts w:ascii="Arial" w:hAnsi="Arial" w:cs="Arial" w:eastAsia="Arial"/>
+          <w:color w:val="333333"/>
+          <w:spacing w:val="0"/>
+          <w:position w:val="0"/>
+          <w:sz w:val="18"/>
+          <w:shd w:fill="auto" w:val="clear"/>
+        </w:rPr>
+        <w:t xml:space="preserve">Drove SOC 2 Type I completion end-to-end via Vanta, including policy authoring, MDM configuration (NanoMDM), device offboarding checklists, and evidence collection using AI-assisted compliance drafting.</w:t>
+      </w:r>
+    </w:p>
+    <w:p>
+      <w:pPr>
+        <w:numPr>
+          <w:ilvl w:val="0"/>
+          <w:numId w:val="10"/>
+        </w:numPr>
+        <w:spacing w:before="15" w:after="15" w:line="240"/>
+        <w:ind w:right="0" w:left="450" w:hanging="220"/>
+        <w:jc w:val="left"/>
+        <w:rPr>
+          <w:rFonts w:ascii="Arial" w:hAnsi="Arial" w:cs="Arial" w:eastAsia="Arial"/>
+          <w:color w:val="333333"/>
+          <w:spacing w:val="0"/>
+          <w:position w:val="0"/>
+          <w:sz w:val="18"/>
+          <w:shd w:fill="auto" w:val="clear"/>
+        </w:rPr>
+      </w:pPr>
+      <w:r>
+        <w:rPr>
+          <w:rFonts w:ascii="Arial" w:hAnsi="Arial" w:cs="Arial" w:eastAsia="Arial"/>
+          <w:color w:val="333333"/>
+          <w:spacing w:val="0"/>
+          <w:position w:val="0"/>
+          <w:sz w:val="18"/>
+          <w:shd w:fill="auto" w:val="clear"/>
+        </w:rPr>
+        <w:t xml:space="preserve">Contributed copy for all product marketing across Infinibranch platform launches (Liquid Metal, Browsers, Devboxes) spanning Twitter, LinkedIn, email, and Slack, using AI writing agents to generate and iterate at volume under rapid launch cycles.</w:t>
+      </w:r>
+    </w:p>
+    <w:p>
+      <w:pPr>
+        <w:numPr>
+          <w:ilvl w:val="0"/>
+          <w:numId w:val="10"/>
+        </w:numPr>
+        <w:spacing w:before="15" w:after="15" w:line="240"/>
+        <w:ind w:right="0" w:left="450" w:hanging="220"/>
+        <w:jc w:val="left"/>
+        <w:rPr>
+          <w:rFonts w:ascii="Arial" w:hAnsi="Arial" w:cs="Arial" w:eastAsia="Arial"/>
+          <w:color w:val="333333"/>
+          <w:spacing w:val="0"/>
+          <w:position w:val="0"/>
+          <w:sz w:val="18"/>
+          <w:shd w:fill="auto" w:val="clear"/>
+        </w:rPr>
+      </w:pPr>
+      <w:r>
+        <w:rPr>
+          <w:rFonts w:ascii="Arial" w:hAnsi="Arial" w:cs="Arial" w:eastAsia="Arial"/>
+          <w:color w:val="333333"/>
+          <w:spacing w:val="0"/>
+          <w:position w:val="0"/>
+          <w:sz w:val="18"/>
+          <w:shd w:fill="auto" w:val="clear"/>
+        </w:rPr>
+        <w:t xml:space="preserve">Built and executed influencer pricing playbook with CPM-based framework, CAC ceiling modeling ($50/signup), and brand-safety criteria for CLI coding-agent creator partnerships.</w:t>
+      </w:r>
+    </w:p>
+    <w:p>
+      <w:pPr>
+        <w:numPr>
+          <w:ilvl w:val="0"/>
+          <w:numId w:val="10"/>
+        </w:numPr>
+        <w:spacing w:before="15" w:after="15" w:line="240"/>
+        <w:ind w:right="0" w:left="450" w:hanging="220"/>
+        <w:jc w:val="left"/>
+        <w:rPr>
+          <w:rFonts w:ascii="Arial" w:hAnsi="Arial" w:cs="Arial" w:eastAsia="Arial"/>
+          <w:color w:val="333333"/>
+          <w:spacing w:val="0"/>
+          <w:position w:val="0"/>
+          <w:sz w:val="18"/>
+          <w:shd w:fill="auto" w:val="clear"/>
+        </w:rPr>
+      </w:pPr>
+      <w:r>
+        <w:rPr>
+          <w:rFonts w:ascii="Arial" w:hAnsi="Arial" w:cs="Arial" w:eastAsia="Arial"/>
+          <w:color w:val="333333"/>
+          <w:spacing w:val="0"/>
+          <w:position w:val="0"/>
+          <w:sz w:val="18"/>
+          <w:shd w:fill="auto" w:val="clear"/>
+        </w:rPr>
+        <w:t xml:space="preserve">Designed a customizable recruiting pipeline with configurable targeting parameters (degree type, GitHub activity heuristics, commit frequency, OSS contribution depth) and AI-driven candidate discovery and outreach personalization.</w:t>
+      </w:r>
+    </w:p>
+    <w:p>
+      <w:pPr>
+        <w:numPr>
+          <w:ilvl w:val="0"/>
+          <w:numId w:val="10"/>
+        </w:numPr>
+        <w:spacing w:before="15" w:after="15" w:line="240"/>
+        <w:ind w:right="0" w:left="450" w:hanging="220"/>
+        <w:jc w:val="left"/>
+        <w:rPr>
+          <w:rFonts w:ascii="Arial" w:hAnsi="Arial" w:cs="Arial" w:eastAsia="Arial"/>
+          <w:color w:val="333333"/>
+          <w:spacing w:val="0"/>
+          <w:position w:val="0"/>
+          <w:sz w:val="18"/>
+          <w:shd w:fill="auto" w:val="clear"/>
+        </w:rPr>
+      </w:pPr>
+      <w:r>
+        <w:rPr>
+          <w:rFonts w:ascii="Arial" w:hAnsi="Arial" w:cs="Arial" w:eastAsia="Arial"/>
+          <w:color w:val="333333"/>
+          <w:spacing w:val="0"/>
+          <w:position w:val="0"/>
+          <w:sz w:val="18"/>
+          <w:shd w:fill="auto" w:val="clear"/>
+        </w:rPr>
+        <w:t xml:space="preserve">Managed Stripe billing infrastructure, SendGrid email campaigns, and built fraud detection systems for the platform's internal credit system.</w:t>
+      </w:r>
+    </w:p>
+    <w:p>
+      <w:pPr>
+        <w:numPr>
+          <w:ilvl w:val="0"/>
+          <w:numId w:val="10"/>
+        </w:numPr>
+        <w:spacing w:before="15" w:after="15" w:line="240"/>
+        <w:ind w:right="0" w:left="450" w:hanging="220"/>
+        <w:jc w:val="left"/>
+        <w:rPr>
+          <w:rFonts w:ascii="Arial" w:hAnsi="Arial" w:cs="Arial" w:eastAsia="Arial"/>
+          <w:color w:val="333333"/>
+          <w:spacing w:val="0"/>
+          <w:position w:val="0"/>
+          <w:sz w:val="18"/>
+          <w:shd w:fill="auto" w:val="clear"/>
+        </w:rPr>
+      </w:pPr>
+      <w:r>
+        <w:rPr>
+          <w:rFonts w:ascii="Arial" w:hAnsi="Arial" w:cs="Arial" w:eastAsia="Arial"/>
+          <w:color w:val="333333"/>
+          <w:spacing w:val="0"/>
+          <w:position w:val="0"/>
+          <w:sz w:val="18"/>
+          <w:shd w:fill="auto" w:val="clear"/>
+        </w:rPr>
+        <w:t xml:space="preserve">Conducted YC F25 company research and built targeted outbound email campaigns for enterprise GTM motion.</w:t>
+      </w:r>
+    </w:p>
+    <w:p>
+      <w:pPr>
+        <w:numPr>
+          <w:ilvl w:val="0"/>
+          <w:numId w:val="10"/>
+        </w:numPr>
+        <w:spacing w:before="15" w:after="15" w:line="240"/>
+        <w:ind w:right="0" w:left="450" w:hanging="220"/>
+        <w:jc w:val="left"/>
+        <w:rPr>
+          <w:rFonts w:ascii="Arial" w:hAnsi="Arial" w:cs="Arial" w:eastAsia="Arial"/>
+          <w:color w:val="333333"/>
+          <w:spacing w:val="0"/>
+          <w:position w:val="0"/>
+          <w:sz w:val="18"/>
+          <w:shd w:fill="auto" w:val="clear"/>
+        </w:rPr>
+      </w:pPr>
+      <w:r>
+        <w:rPr>
+          <w:rFonts w:ascii="Arial" w:hAnsi="Arial" w:cs="Arial" w:eastAsia="Arial"/>
+          <w:color w:val="333333"/>
+          <w:spacing w:val="0"/>
+          <w:position w:val="0"/>
+          <w:sz w:val="18"/>
+          <w:shd w:fill="auto" w:val="clear"/>
+        </w:rPr>
+        <w:t xml:space="preserve">Handled the administrative and compliance work behind a federal research contract.</w:t>
+      </w:r>
+    </w:p>
+    <w:p>
+      <w:pPr>
+        <w:numPr>
+          <w:ilvl w:val="0"/>
+          <w:numId w:val="10"/>
+        </w:numPr>
+        <w:spacing w:before="15" w:after="15" w:line="240"/>
+        <w:ind w:right="0" w:left="450" w:hanging="220"/>
+        <w:jc w:val="left"/>
+        <w:rPr>
+          <w:rFonts w:ascii="Arial" w:hAnsi="Arial" w:cs="Arial" w:eastAsia="Arial"/>
+          <w:color w:val="333333"/>
+          <w:spacing w:val="0"/>
+          <w:position w:val="0"/>
+          <w:sz w:val="18"/>
+          <w:shd w:fill="auto" w:val="clear"/>
+        </w:rPr>
+      </w:pPr>
+      <w:r>
+        <w:rPr>
+          <w:rFonts w:ascii="Arial" w:hAnsi="Arial" w:cs="Arial" w:eastAsia="Arial"/>
+          <w:color w:val="333333"/>
+          <w:spacing w:val="0"/>
+          <w:position w:val="0"/>
+          <w:sz w:val="18"/>
+          <w:shd w:fill="auto" w:val="clear"/>
+        </w:rPr>
+        <w:t xml:space="preserve">Developed reusable Codex skills for a proprietary multi-agent orchestrator, compressing full weeks of manual operational work into single automated skill calls across competitive analysis reports, high-signal event sourcing, and recruiting.</w:t>
+      </w:r>
+    </w:p>
+    <w:p>
+      <w:pPr>
+        <w:tabs>
+          <w:tab w:val="right" w:pos="9026" w:leader="none"/>
+        </w:tabs>
+        <w:spacing w:before="80" w:after="20" w:line="240"/>
+        <w:ind w:right="0" w:left="0" w:firstLine="0"/>
+        <w:jc w:val="left"/>
+        <w:rPr>
+          <w:rFonts w:ascii="Arial" w:hAnsi="Arial" w:cs="Arial" w:eastAsia="Arial"/>
+          <w:color w:val="333333"/>
+          <w:spacing w:val="0"/>
+          <w:position w:val="0"/>
+          <w:sz w:val="18"/>
+          <w:shd w:fill="auto" w:val="clear"/>
+        </w:rPr>
+      </w:pPr>
+      <w:r>
+        <w:rPr>
+          <w:rFonts w:ascii="Arial" w:hAnsi="Arial" w:cs="Arial" w:eastAsia="Arial"/>
+          <w:b/>
+          <w:color w:val="1A1A2E"/>
+          <w:spacing w:val="0"/>
+          <w:position w:val="0"/>
+          <w:sz w:val="19"/>
+          <w:shd w:fill="auto" w:val="clear"/>
+        </w:rPr>
         <w:t xml:space="preserve">Shop Supervisor</w:t>
       </w:r>
       <w:r>
@@ -678,7 +867,7 @@
           <w:sz w:val="18"/>
           <w:shd w:fill="auto" w:val="clear"/>
         </w:rPr>
-        <w:t xml:space="preserve">May 2017 - Present</w:t>
+        <w:t xml:space="preserve">May 2017 - Feb 2025</w:t>
       </w:r>
     </w:p>
     <w:p>
@@ -1045,18 +1234,18 @@
           <w:sz w:val="18"/>
           <w:shd w:fill="auto" w:val="clear"/>
         </w:rPr>
-        <w:t xml:space="preserve">Morris Park Transit Widget: </w:t>
-      </w:r>
-      <w:r>
-        <w:rPr>
-          <w:rFonts w:ascii="Arial" w:hAnsi="Arial" w:cs="Arial" w:eastAsia="Arial"/>
-          <w:color w:val="333333"/>
-          <w:spacing w:val="0"/>
-          <w:position w:val="0"/>
-          <w:sz w:val="18"/>
-          <w:shd w:fill="auto" w:val="clear"/>
-        </w:rPr>
-        <w:t xml:space="preserve">WPF desktop app for real-time 5 Train and BxM10 arrivals via MTA APIs.</w:t>
+        <w:t xml:space="preserve">MTA Widget:</w:t>
+      </w:r>
+      <w:r>
+        <w:rPr>
+          <w:rFonts w:ascii="Arial" w:hAnsi="Arial" w:cs="Arial" w:eastAsia="Arial"/>
+          <w:color w:val="333333"/>
+          <w:spacing w:val="0"/>
+          <w:position w:val="0"/>
+          <w:sz w:val="18"/>
+          <w:shd w:fill="auto" w:val="clear"/>
+        </w:rPr>
+        <w:t xml:space="preserve"> WPF desktop app for real-time 5 Train and BxM10 arrivals via MTA APIs.</w:t>
       </w:r>
     </w:p>
     <w:p>
@@ -1087,18 +1276,18 @@
           <w:sz w:val="18"/>
           <w:shd w:fill="auto" w:val="clear"/>
         </w:rPr>
-        <w:t xml:space="preserve">Judo Throw Detection System: </w:t>
-      </w:r>
-      <w:r>
-        <w:rPr>
-          <w:rFonts w:ascii="Arial" w:hAnsi="Arial" w:cs="Arial" w:eastAsia="Arial"/>
-          <w:color w:val="333333"/>
-          <w:spacing w:val="0"/>
-          <w:position w:val="0"/>
-          <w:sz w:val="18"/>
-          <w:shd w:fill="auto" w:val="clear"/>
-        </w:rPr>
-        <w:t xml:space="preserve">ML prototype using MediaPipe pose estimation, targeting Jetson Orin Nano for real-time throw classification.</w:t>
+        <w:t xml:space="preserve">Real-Time Multiplayer Typing Game:</w:t>
+      </w:r>
+      <w:r>
+        <w:rPr>
+          <w:rFonts w:ascii="Arial" w:hAnsi="Arial" w:cs="Arial" w:eastAsia="Arial"/>
+          <w:color w:val="333333"/>
+          <w:spacing w:val="0"/>
+          <w:position w:val="0"/>
+          <w:sz w:val="18"/>
+          <w:shd w:fill="auto" w:val="clear"/>
+        </w:rPr>
+        <w:t xml:space="preserve"> Browser-based two-player typing game expanded into a persistent Three.js quail garden/life-sim with synchronized rooms, resilient Socket.IO flow, interactive visitors, fireworks, and zone-focused park navigation.</w:t>
       </w:r>
     </w:p>
     <w:p>
@@ -1129,18 +1318,18 @@
           <w:sz w:val="18"/>
           <w:shd w:fill="auto" w:val="clear"/>
         </w:rPr>
-        <w:t xml:space="preserve">3D Injury Recovery Timeline: </w:t>
-      </w:r>
-      <w:r>
-        <w:rPr>
-          <w:rFonts w:ascii="Arial" w:hAnsi="Arial" w:cs="Arial" w:eastAsia="Arial"/>
-          <w:color w:val="333333"/>
-          <w:spacing w:val="0"/>
-          <w:position w:val="0"/>
-          <w:sz w:val="18"/>
-          <w:shd w:fill="auto" w:val="clear"/>
-        </w:rPr>
-        <w:t xml:space="preserve">Interactive React/Three.js visualization mapping recovery milestones against training readiness.</w:t>
+        <w:t xml:space="preserve">3D Injury Recovery Timeline:</w:t>
+      </w:r>
+      <w:r>
+        <w:rPr>
+          <w:rFonts w:ascii="Arial" w:hAnsi="Arial" w:cs="Arial" w:eastAsia="Arial"/>
+          <w:color w:val="333333"/>
+          <w:spacing w:val="0"/>
+          <w:position w:val="0"/>
+          <w:sz w:val="18"/>
+          <w:shd w:fill="auto" w:val="clear"/>
+        </w:rPr>
+        <w:t xml:space="preserve"> Interactive React/Three.js visualization mapping recovery milestones against training readiness.</w:t>
       </w:r>
     </w:p>
     <w:p>
@@ -1171,18 +1360,18 @@
           <w:sz w:val="18"/>
           <w:shd w:fill="auto" w:val="clear"/>
         </w:rPr>
-        <w:t xml:space="preserve">Private Equity Research Workflow: </w:t>
-      </w:r>
-      <w:r>
-        <w:rPr>
-          <w:rFonts w:ascii="Arial" w:hAnsi="Arial" w:cs="Arial" w:eastAsia="Arial"/>
-          <w:color w:val="333333"/>
-          <w:spacing w:val="0"/>
-          <w:position w:val="0"/>
-          <w:sz w:val="18"/>
-          <w:shd w:fill="auto" w:val="clear"/>
-        </w:rPr>
-        <w:t xml:space="preserve">AI-augmented analysis pipeline with automated financial data extraction, competitive mapping, and thesis generation.</w:t>
+        <w:t xml:space="preserve">Private Equity Research Workflow:</w:t>
+      </w:r>
+      <w:r>
+        <w:rPr>
+          <w:rFonts w:ascii="Arial" w:hAnsi="Arial" w:cs="Arial" w:eastAsia="Arial"/>
+          <w:color w:val="333333"/>
+          <w:spacing w:val="0"/>
+          <w:position w:val="0"/>
+          <w:sz w:val="18"/>
+          <w:shd w:fill="auto" w:val="clear"/>
+        </w:rPr>
+        <w:t xml:space="preserve"> Investment-research pipeline built on a multi-agent orchestrator — research agents fan out in parallel, each running in its own isolated environment, to extract financial data, map the competitive landscape, and draft an investment thesis, converging into a single structured deep-dive.</w:t>
       </w:r>
     </w:p>
     <w:p>
@@ -1325,87 +1514,7 @@
           <w:sz w:val="17"/>
           <w:shd w:fill="auto" w:val="clear"/>
         </w:rPr>
-        <w:t xml:space="preserve">AI/LLM: </w:t>
-      </w:r>
-      <w:r>
-        <w:rPr>
-          <w:rFonts w:ascii="Arial" w:hAnsi="Arial" w:cs="Arial" w:eastAsia="Arial"/>
-          <w:color w:val="555555"/>
-          <w:spacing w:val="0"/>
-          <w:position w:val="0"/>
-          <w:sz w:val="17"/>
-          <w:shd w:fill="auto" w:val="clear"/>
-        </w:rPr>
-        <w:t xml:space="preserve">Claude Code/GPT Codex, proprietary multi-agent orchestrators, Morph Cloud (Agentic Cloud)  |  </w:t>
-      </w:r>
-      <w:r>
-        <w:rPr>
-          <w:rFonts w:ascii="Arial" w:hAnsi="Arial" w:cs="Arial" w:eastAsia="Arial"/>
-          <w:b/>
-          <w:color w:val="1A1A2E"/>
-          <w:spacing w:val="0"/>
-          <w:position w:val="0"/>
-          <w:sz w:val="17"/>
-          <w:shd w:fill="auto" w:val="clear"/>
-        </w:rPr>
-        <w:t xml:space="preserve">Engineering: </w:t>
-      </w:r>
-      <w:r>
-        <w:rPr>
-          <w:rFonts w:ascii="Arial" w:hAnsi="Arial" w:cs="Arial" w:eastAsia="Arial"/>
-          <w:color w:val="555555"/>
-          <w:spacing w:val="0"/>
-          <w:position w:val="0"/>
-          <w:sz w:val="17"/>
-          <w:shd w:fill="auto" w:val="clear"/>
-        </w:rPr>
-        <w:t xml:space="preserve">React, Python, JS/TS, Three.js, WPF, REST APIs, MediaPipe  |  </w:t>
-      </w:r>
-      <w:r>
-        <w:rPr>
-          <w:rFonts w:ascii="Arial" w:hAnsi="Arial" w:cs="Arial" w:eastAsia="Arial"/>
-          <w:b/>
-          <w:color w:val="1A1A2E"/>
-          <w:spacing w:val="0"/>
-          <w:position w:val="0"/>
-          <w:sz w:val="17"/>
-          <w:shd w:fill="auto" w:val="clear"/>
-        </w:rPr>
-        <w:t xml:space="preserve">Operations: </w:t>
-      </w:r>
-      <w:r>
-        <w:rPr>
-          <w:rFonts w:ascii="Arial" w:hAnsi="Arial" w:cs="Arial" w:eastAsia="Arial"/>
-          <w:color w:val="555555"/>
-          <w:spacing w:val="0"/>
-          <w:position w:val="0"/>
-          <w:sz w:val="17"/>
-          <w:shd w:fill="auto" w:val="clear"/>
-        </w:rPr>
-        <w:t xml:space="preserve">Vanta, Stripe, SendGrid, NanoMDM, Notion, Obsidian, Git  |  </w:t>
-      </w:r>
-      <w:r>
-        <w:rPr>
-          <w:rFonts w:ascii="Arial" w:hAnsi="Arial" w:cs="Arial" w:eastAsia="Arial"/>
-          <w:b/>
-          <w:color w:val="1A1A2E"/>
-          <w:spacing w:val="0"/>
-          <w:position w:val="0"/>
-          <w:sz w:val="17"/>
-          <w:shd w:fill="auto" w:val="clear"/>
-        </w:rPr>
-        <w:t xml:space="preserve">Marketing: </w:t>
-      </w:r>
-      <w:r>
-        <w:rPr>
-          <w:rFonts w:ascii="Arial" w:hAnsi="Arial" w:cs="Arial" w:eastAsia="Arial"/>
-          <w:color w:val="555555"/>
-          <w:spacing w:val="0"/>
-          <w:position w:val="0"/>
-          <w:sz w:val="17"/>
-          <w:shd w:fill="auto" w:val="clear"/>
-        </w:rPr>
-        <w:t xml:space="preserve">Influencer partnerships, email campaigns, product positioning</w:t>
+        <w:t xml:space="preserve">AI/LLM: Claude Code/GPT Codex, proprietary multi-agent orchestrators, Morph Cloud (Agentic Cloud)  |  Engineering: React, Python, JS/TS, Three.js, WPF, REST APIs, MediaPipe, OpenCV, YOLOv8-Pose/PyTorch, scikit-learn  |  Operations: Vanta, Stripe, SendGrid, NanoMDM, Notion, Obsidian, Git  |  Marketing: Influencer partnerships, email campaigns, product positioning, developer advocacy</w:t>
       </w:r>
     </w:p>
   </w:body>

</xml_diff>